<commit_message>
Strengthen decision benefit evaluation and dashboard evidence
</commit_message>
<xml_diff>
--- a/docs/competition_report.docx
+++ b/docs/competition_report.docx
@@ -170,7 +170,16 @@
           <w:sz w:val="22"/>
           <w:szCs w:val="22"/>
         </w:rPr>
-        <w:t xml:space="preserve">所有 RL 推荐动作先进入安全盾，检查曝气强度上下限、PAC 投加上下限、单次最大调节步长和出水合规风险。若动作不可行，系统回退到局部有界专家搜索。</w:t>
+        <w:t xml:space="preserve">所有 RL 推荐动作先进入安全盾，检查曝气强度上下限、PAC 投加上下限、单次最大调节步长和出水合规风险。随后进入安全与目标函数仲裁层：若 RL 动作不可行，或局部有界专家搜索能给出更优的合规动作，则回退到专家动作。</w:t>
+      </w:r>
+    </w:p>
+    <w:p>
+      <w:r>
+        <w:rPr>
+          <w:sz w:val="22"/>
+          <w:szCs w:val="22"/>
+        </w:rPr>
+        <w:t xml:space="preserve">核心目标函数：J = wq * 水质风险 + we * 曝气能耗 + wc * PAC药耗 + ws * 平滑项 + wv * 违规惩罚；系统最小化 J，并将 reward 定义为 -J。</w:t>
       </w:r>
     </w:p>
     <w:p>
@@ -831,7 +840,7 @@
                 <w:sz w:val="20"/>
                 <w:szCs w:val="20"/>
               </w:rPr>
-              <w:t xml:space="preserve">动态控制节能</w:t>
+              <w:t xml:space="preserve">当前控制节能/节药</w:t>
             </w:r>
           </w:p>
         </w:tc>
@@ -857,6 +866,255 @@
                 <w:sz w:val="20"/>
                 <w:szCs w:val="20"/>
               </w:rPr>
+              <w:t xml:space="preserve">38.70% / 69.63%</w:t>
+            </w:r>
+          </w:p>
+        </w:tc>
+        <w:tc>
+          <w:tcPr>
+            <w:tcW w:type="dxa" w:w="3110"/>
+            <w:tcBorders>
+              <w:top w:val="single" w:color="B8CDD4" w:sz="1"/>
+              <w:left w:val="single" w:color="B8CDD4" w:sz="1"/>
+              <w:bottom w:val="single" w:color="B8CDD4" w:sz="1"/>
+              <w:right w:val="single" w:color="B8CDD4" w:sz="1"/>
+            </w:tcBorders>
+            <w:vAlign w:val="center"/>
+          </w:tcPr>
+          <w:p>
+            <w:pPr>
+              <w:jc w:val="left"/>
+            </w:pPr>
+            <w:r>
+              <w:rPr>
+                <w:b w:val="false"/>
+                <w:bCs w:val="false"/>
+                <w:sz w:val="20"/>
+                <w:szCs w:val="20"/>
+              </w:rPr>
+              <w:t xml:space="preserve">安全仲裁后最终推荐</w:t>
+            </w:r>
+          </w:p>
+        </w:tc>
+      </w:tr>
+      <w:tr>
+        <w:trPr>
+          <w:tblHeader w:val="false"/>
+        </w:trPr>
+        <w:tc>
+          <w:tcPr>
+            <w:tcW w:type="dxa" w:w="3100"/>
+            <w:tcBorders>
+              <w:top w:val="single" w:color="B8CDD4" w:sz="1"/>
+              <w:left w:val="single" w:color="B8CDD4" w:sz="1"/>
+              <w:bottom w:val="single" w:color="B8CDD4" w:sz="1"/>
+              <w:right w:val="single" w:color="B8CDD4" w:sz="1"/>
+            </w:tcBorders>
+            <w:vAlign w:val="center"/>
+          </w:tcPr>
+          <w:p>
+            <w:pPr>
+              <w:jc w:val="left"/>
+            </w:pPr>
+            <w:r>
+              <w:rPr>
+                <w:b w:val="false"/>
+                <w:bCs w:val="false"/>
+                <w:sz w:val="20"/>
+                <w:szCs w:val="20"/>
+              </w:rPr>
+              <w:t xml:space="preserve">传统定值节能/节药</w:t>
+            </w:r>
+          </w:p>
+        </w:tc>
+        <w:tc>
+          <w:tcPr>
+            <w:tcW w:type="dxa" w:w="3150"/>
+            <w:tcBorders>
+              <w:top w:val="single" w:color="B8CDD4" w:sz="1"/>
+              <w:left w:val="single" w:color="B8CDD4" w:sz="1"/>
+              <w:bottom w:val="single" w:color="B8CDD4" w:sz="1"/>
+              <w:right w:val="single" w:color="B8CDD4" w:sz="1"/>
+            </w:tcBorders>
+            <w:vAlign w:val="center"/>
+          </w:tcPr>
+          <w:p>
+            <w:pPr>
+              <w:jc w:val="left"/>
+            </w:pPr>
+            <w:r>
+              <w:rPr>
+                <w:b w:val="false"/>
+                <w:bCs w:val="false"/>
+                <w:sz w:val="20"/>
+                <w:szCs w:val="20"/>
+              </w:rPr>
+              <w:t xml:space="preserve">44.98% / 88.97%</w:t>
+            </w:r>
+          </w:p>
+        </w:tc>
+        <w:tc>
+          <w:tcPr>
+            <w:tcW w:type="dxa" w:w="3110"/>
+            <w:tcBorders>
+              <w:top w:val="single" w:color="B8CDD4" w:sz="1"/>
+              <w:left w:val="single" w:color="B8CDD4" w:sz="1"/>
+              <w:bottom w:val="single" w:color="B8CDD4" w:sz="1"/>
+              <w:right w:val="single" w:color="B8CDD4" w:sz="1"/>
+            </w:tcBorders>
+            <w:vAlign w:val="center"/>
+          </w:tcPr>
+          <w:p>
+            <w:pPr>
+              <w:jc w:val="left"/>
+            </w:pPr>
+            <w:r>
+              <w:rPr>
+                <w:b w:val="false"/>
+                <w:bCs w:val="false"/>
+                <w:sz w:val="20"/>
+                <w:szCs w:val="20"/>
+              </w:rPr>
+              <w:t xml:space="preserve">训练期 P90 保守定值对照</w:t>
+            </w:r>
+          </w:p>
+        </w:tc>
+      </w:tr>
+      <w:tr>
+        <w:trPr>
+          <w:tblHeader w:val="false"/>
+        </w:trPr>
+        <w:tc>
+          <w:tcPr>
+            <w:tcW w:type="dxa" w:w="3100"/>
+            <w:tcBorders>
+              <w:top w:val="single" w:color="B8CDD4" w:sz="1"/>
+              <w:left w:val="single" w:color="B8CDD4" w:sz="1"/>
+              <w:bottom w:val="single" w:color="B8CDD4" w:sz="1"/>
+              <w:right w:val="single" w:color="B8CDD4" w:sz="1"/>
+            </w:tcBorders>
+            <w:vAlign w:val="center"/>
+          </w:tcPr>
+          <w:p>
+            <w:pPr>
+              <w:jc w:val="left"/>
+            </w:pPr>
+            <w:r>
+              <w:rPr>
+                <w:b w:val="false"/>
+                <w:bCs w:val="false"/>
+                <w:sz w:val="20"/>
+                <w:szCs w:val="20"/>
+              </w:rPr>
+              <w:t xml:space="preserve">P95 响应时间</w:t>
+            </w:r>
+          </w:p>
+        </w:tc>
+        <w:tc>
+          <w:tcPr>
+            <w:tcW w:type="dxa" w:w="3150"/>
+            <w:tcBorders>
+              <w:top w:val="single" w:color="B8CDD4" w:sz="1"/>
+              <w:left w:val="single" w:color="B8CDD4" w:sz="1"/>
+              <w:bottom w:val="single" w:color="B8CDD4" w:sz="1"/>
+              <w:right w:val="single" w:color="B8CDD4" w:sz="1"/>
+            </w:tcBorders>
+            <w:vAlign w:val="center"/>
+          </w:tcPr>
+          <w:p>
+            <w:pPr>
+              <w:jc w:val="left"/>
+            </w:pPr>
+            <w:r>
+              <w:rPr>
+                <w:b w:val="false"/>
+                <w:bCs w:val="false"/>
+                <w:sz w:val="20"/>
+                <w:szCs w:val="20"/>
+              </w:rPr>
+              <w:t xml:space="preserve">1.9 ms</w:t>
+            </w:r>
+          </w:p>
+        </w:tc>
+        <w:tc>
+          <w:tcPr>
+            <w:tcW w:type="dxa" w:w="3110"/>
+            <w:tcBorders>
+              <w:top w:val="single" w:color="B8CDD4" w:sz="1"/>
+              <w:left w:val="single" w:color="B8CDD4" w:sz="1"/>
+              <w:bottom w:val="single" w:color="B8CDD4" w:sz="1"/>
+              <w:right w:val="single" w:color="B8CDD4" w:sz="1"/>
+            </w:tcBorders>
+            <w:vAlign w:val="center"/>
+          </w:tcPr>
+          <w:p>
+            <w:pPr>
+              <w:jc w:val="left"/>
+            </w:pPr>
+            <w:r>
+              <w:rPr>
+                <w:b w:val="false"/>
+                <w:bCs w:val="false"/>
+                <w:sz w:val="20"/>
+                <w:szCs w:val="20"/>
+              </w:rPr>
+              <w:t xml:space="preserve">单组推荐响应 ≤1s</w:t>
+            </w:r>
+          </w:p>
+        </w:tc>
+      </w:tr>
+      <w:tr>
+        <w:trPr>
+          <w:tblHeader w:val="false"/>
+        </w:trPr>
+        <w:tc>
+          <w:tcPr>
+            <w:tcW w:type="dxa" w:w="3100"/>
+            <w:tcBorders>
+              <w:top w:val="single" w:color="B8CDD4" w:sz="1"/>
+              <w:left w:val="single" w:color="B8CDD4" w:sz="1"/>
+              <w:bottom w:val="single" w:color="B8CDD4" w:sz="1"/>
+              <w:right w:val="single" w:color="B8CDD4" w:sz="1"/>
+            </w:tcBorders>
+            <w:vAlign w:val="center"/>
+          </w:tcPr>
+          <w:p>
+            <w:pPr>
+              <w:jc w:val="left"/>
+            </w:pPr>
+            <w:r>
+              <w:rPr>
+                <w:b w:val="false"/>
+                <w:bCs w:val="false"/>
+                <w:sz w:val="20"/>
+                <w:szCs w:val="20"/>
+              </w:rPr>
+              <w:t xml:space="preserve">论文复现动态节能</w:t>
+            </w:r>
+          </w:p>
+        </w:tc>
+        <w:tc>
+          <w:tcPr>
+            <w:tcW w:type="dxa" w:w="3150"/>
+            <w:tcBorders>
+              <w:top w:val="single" w:color="B8CDD4" w:sz="1"/>
+              <w:left w:val="single" w:color="B8CDD4" w:sz="1"/>
+              <w:bottom w:val="single" w:color="B8CDD4" w:sz="1"/>
+              <w:right w:val="single" w:color="B8CDD4" w:sz="1"/>
+            </w:tcBorders>
+            <w:vAlign w:val="center"/>
+          </w:tcPr>
+          <w:p>
+            <w:pPr>
+              <w:jc w:val="left"/>
+            </w:pPr>
+            <w:r>
+              <w:rPr>
+                <w:b w:val="false"/>
+                <w:bCs w:val="false"/>
+                <w:sz w:val="20"/>
+                <w:szCs w:val="20"/>
+              </w:rPr>
               <w:t xml:space="preserve">4.45%</w:t>
             </w:r>
           </w:p>
@@ -883,7 +1141,7 @@
                 <w:sz w:val="20"/>
                 <w:szCs w:val="20"/>
               </w:rPr>
-              <w:t xml:space="preserve">论文复现链路动态回放对照</w:t>
+              <w:t xml:space="preserve">Water Research 方法链复现对照</w:t>
             </w:r>
           </w:p>
         </w:tc>
@@ -943,6 +1201,54 @@
           <w:szCs w:val="22"/>
         </w:rPr>
         <w:t xml:space="preserve">Safe-MARL 推荐可行率为 100.0%。</w:t>
+      </w:r>
+    </w:p>
+    <w:p>
+      <w:pPr>
+        <w:pStyle w:val="ListParagraph"/>
+        <w:numPr>
+          <w:ilvl w:val="0"/>
+          <w:numId w:val="2"/>
+        </w:numPr>
+      </w:pPr>
+      <w:r>
+        <w:rPr>
+          <w:sz w:val="22"/>
+          <w:szCs w:val="22"/>
+        </w:rPr>
+        <w:t xml:space="preserve">相对当前控制，曝气节能 38.70%，PAC 节药 69.63%。</w:t>
+      </w:r>
+    </w:p>
+    <w:p>
+      <w:pPr>
+        <w:pStyle w:val="ListParagraph"/>
+        <w:numPr>
+          <w:ilvl w:val="0"/>
+          <w:numId w:val="2"/>
+        </w:numPr>
+      </w:pPr>
+      <w:r>
+        <w:rPr>
+          <w:sz w:val="22"/>
+          <w:szCs w:val="22"/>
+        </w:rPr>
+        <w:t xml:space="preserve">相对传统保守定值，曝气节能 44.98%，PAC 节药 88.97%。</w:t>
+      </w:r>
+    </w:p>
+    <w:p>
+      <w:pPr>
+        <w:pStyle w:val="ListParagraph"/>
+        <w:numPr>
+          <w:ilvl w:val="0"/>
+          <w:numId w:val="2"/>
+        </w:numPr>
+      </w:pPr>
+      <w:r>
+        <w:rPr>
+          <w:sz w:val="22"/>
+          <w:szCs w:val="22"/>
+        </w:rPr>
+        <w:t xml:space="preserve">单组推荐响应 P95 为 1.9 ms，最大 3.0 ms。</w:t>
       </w:r>
     </w:p>
     <w:p>

</xml_diff>

<commit_message>
Add final scoring evidence and literature mapping
</commit_message>
<xml_diff>
--- a/docs/competition_report.docx
+++ b/docs/competition_report.docx
@@ -1360,7 +1360,95 @@
         <w:pStyle w:val="Heading1"/>
       </w:pPr>
       <w:r>
-        <w:t xml:space="preserve">8. 可视化大屏截图</w:t>
+        <w:t xml:space="preserve">8. 评审索引</w:t>
+      </w:r>
+    </w:p>
+    <w:p>
+      <w:pPr>
+        <w:pStyle w:val="ListParagraph"/>
+        <w:numPr>
+          <w:ilvl w:val="0"/>
+          <w:numId w:val="2"/>
+        </w:numPr>
+      </w:pPr>
+      <w:r>
+        <w:rPr>
+          <w:sz w:val="22"/>
+          <w:szCs w:val="22"/>
+        </w:rPr>
+        <w:t xml:space="preserve">评分项证据矩阵：docs/final_scoring_matrix.md。</w:t>
+      </w:r>
+    </w:p>
+    <w:p>
+      <w:pPr>
+        <w:pStyle w:val="ListParagraph"/>
+        <w:numPr>
+          <w:ilvl w:val="0"/>
+          <w:numId w:val="2"/>
+        </w:numPr>
+      </w:pPr>
+      <w:r>
+        <w:rPr>
+          <w:sz w:val="22"/>
+          <w:szCs w:val="22"/>
+        </w:rPr>
+        <w:t xml:space="preserve">论文依据与创新对照表：docs/literature_basis_table.md。</w:t>
+      </w:r>
+    </w:p>
+    <w:p>
+      <w:pPr>
+        <w:pStyle w:val="ListParagraph"/>
+        <w:numPr>
+          <w:ilvl w:val="0"/>
+          <w:numId w:val="2"/>
+        </w:numPr>
+      </w:pPr>
+      <w:r>
+        <w:rPr>
+          <w:sz w:val="22"/>
+          <w:szCs w:val="22"/>
+        </w:rPr>
+        <w:t xml:space="preserve">系统对接手册：docs/system_integration_manual.md。</w:t>
+      </w:r>
+    </w:p>
+    <w:p>
+      <w:pPr>
+        <w:pStyle w:val="ListParagraph"/>
+        <w:numPr>
+          <w:ilvl w:val="0"/>
+          <w:numId w:val="2"/>
+        </w:numPr>
+      </w:pPr>
+      <w:r>
+        <w:rPr>
+          <w:sz w:val="22"/>
+          <w:szCs w:val="22"/>
+        </w:rPr>
+        <w:t xml:space="preserve">部署运行说明：docs/deployment_guide.md。</w:t>
+      </w:r>
+    </w:p>
+    <w:p>
+      <w:pPr>
+        <w:pStyle w:val="ListParagraph"/>
+        <w:numPr>
+          <w:ilvl w:val="0"/>
+          <w:numId w:val="2"/>
+        </w:numPr>
+      </w:pPr>
+      <w:r>
+        <w:rPr>
+          <w:sz w:val="22"/>
+          <w:szCs w:val="22"/>
+        </w:rPr>
+        <w:t xml:space="preserve">演示脚本：docs/demo_script.md。</w:t>
+      </w:r>
+    </w:p>
+    <w:p>
+      <w:pPr>
+        <w:pStyle w:val="Heading1"/>
+      </w:pPr>
+      <w:r>
+        <w:t xml:space="preserve">9. 可视化大屏截图</w:t>
       </w:r>
     </w:p>
     <w:p>

</xml_diff>

<commit_message>
Add minute-level data fusion simulation
</commit_message>
<xml_diff>
--- a/docs/competition_report.docx
+++ b/docs/competition_report.docx
@@ -111,7 +111,23 @@
           <w:sz w:val="22"/>
           <w:szCs w:val="22"/>
         </w:rPr>
-        <w:t xml:space="preserve">融合数据长表 1M 行，覆盖 china_public_monitor、local_plant、us_wqp。</w:t>
+        <w:t xml:space="preserve">融合数据长表 1.60M 行，覆盖 china_public_monitor、agtrup_bluekolding_2min、local_plant、iwa_bsm1_dynamic_influent、us_wqp。</w:t>
+      </w:r>
+    </w:p>
+    <w:p>
+      <w:pPr>
+        <w:pStyle w:val="ListParagraph"/>
+        <w:numPr>
+          <w:ilvl w:val="0"/>
+          <w:numId w:val="2"/>
+        </w:numPr>
+      </w:pPr>
+      <w:r>
+        <w:rPr>
+          <w:sz w:val="22"/>
+          <w:szCs w:val="22"/>
+        </w:rPr>
+        <w:t xml:space="preserve">高频数据 26万 行，其中分钟级 24万 行，最小原始粒度 2 分钟。</w:t>
       </w:r>
     </w:p>
     <w:p>
@@ -368,7 +384,7 @@
                 <w:sz w:val="20"/>
                 <w:szCs w:val="20"/>
               </w:rPr>
-              <w:t xml:space="preserve">1M</w:t>
+              <w:t xml:space="preserve">1.60M</w:t>
             </w:r>
           </w:p>
         </w:tc>
@@ -394,7 +410,7 @@
                 <w:sz w:val="20"/>
                 <w:szCs w:val="20"/>
               </w:rPr>
-              <w:t xml:space="preserve">本地单厂 + 国内公开监测 + WQP 联网补充</w:t>
+              <w:t xml:space="preserve">本地单厂 + 国内公开监测 + WQP + BSM1 + Agtrup 2分钟</w:t>
             </w:r>
           </w:p>
         </w:tc>
@@ -425,7 +441,7 @@
                 <w:sz w:val="20"/>
                 <w:szCs w:val="20"/>
               </w:rPr>
-              <w:t xml:space="preserve">决策样本</w:t>
+              <w:t xml:space="preserve">分钟级数据</w:t>
             </w:r>
           </w:p>
         </w:tc>
@@ -451,7 +467,7 @@
                 <w:sz w:val="20"/>
                 <w:szCs w:val="20"/>
               </w:rPr>
-              <w:t xml:space="preserve">1万</w:t>
+              <w:t xml:space="preserve">24万</w:t>
             </w:r>
           </w:p>
         </w:tc>
@@ -477,7 +493,7 @@
                 <w:sz w:val="20"/>
                 <w:szCs w:val="20"/>
               </w:rPr>
-              <w:t xml:space="preserve">observed/load_up/rain_dilution 三类工况</w:t>
+              <w:t xml:space="preserve">最小粒度 2 分钟</w:t>
             </w:r>
           </w:p>
         </w:tc>
@@ -508,7 +524,7 @@
                 <w:sz w:val="20"/>
                 <w:szCs w:val="20"/>
               </w:rPr>
-              <w:t xml:space="preserve">监督模型</w:t>
+              <w:t xml:space="preserve">决策样本</w:t>
             </w:r>
           </w:p>
         </w:tc>
@@ -534,7 +550,7 @@
                 <w:sz w:val="20"/>
                 <w:szCs w:val="20"/>
               </w:rPr>
-              <w:t xml:space="preserve">extra_trees</w:t>
+              <w:t xml:space="preserve">1万</w:t>
             </w:r>
           </w:p>
         </w:tc>
@@ -560,7 +576,7 @@
                 <w:sz w:val="20"/>
                 <w:szCs w:val="20"/>
               </w:rPr>
-              <w:t xml:space="preserve">349 个特征，多输出下一小时出水预测</w:t>
+              <w:t xml:space="preserve">observed/load_up/rain_dilution 三类工况</w:t>
             </w:r>
           </w:p>
         </w:tc>
@@ -591,7 +607,7 @@
                 <w:sz w:val="20"/>
                 <w:szCs w:val="20"/>
               </w:rPr>
-              <w:t xml:space="preserve">测试综合误差</w:t>
+              <w:t xml:space="preserve">监督模型</w:t>
             </w:r>
           </w:p>
         </w:tc>
@@ -617,7 +633,7 @@
                 <w:sz w:val="20"/>
                 <w:szCs w:val="20"/>
               </w:rPr>
-              <w:t xml:space="preserve">0.241</w:t>
+              <w:t xml:space="preserve">extra_trees</w:t>
             </w:r>
           </w:p>
         </w:tc>
@@ -643,7 +659,7 @@
                 <w:sz w:val="20"/>
                 <w:szCs w:val="20"/>
               </w:rPr>
-              <w:t xml:space="preserve">污染物重要性加权归一化 MAE</w:t>
+              <w:t xml:space="preserve">349 个特征，多输出下一小时出水预测</w:t>
             </w:r>
           </w:p>
         </w:tc>
@@ -674,7 +690,7 @@
                 <w:sz w:val="20"/>
                 <w:szCs w:val="20"/>
               </w:rPr>
-              <w:t xml:space="preserve">预测达标率</w:t>
+              <w:t xml:space="preserve">测试综合误差</w:t>
             </w:r>
           </w:p>
         </w:tc>
@@ -700,7 +716,7 @@
                 <w:sz w:val="20"/>
                 <w:szCs w:val="20"/>
               </w:rPr>
-              <w:t xml:space="preserve">100.0%</w:t>
+              <w:t xml:space="preserve">0.241</w:t>
             </w:r>
           </w:p>
         </w:tc>
@@ -726,7 +742,7 @@
                 <w:sz w:val="20"/>
                 <w:szCs w:val="20"/>
               </w:rPr>
-              <w:t xml:space="preserve">COD/NH3-N/TP/TN 四目标</w:t>
+              <w:t xml:space="preserve">污染物重要性加权归一化 MAE</w:t>
             </w:r>
           </w:p>
         </w:tc>
@@ -757,7 +773,7 @@
                 <w:sz w:val="20"/>
                 <w:szCs w:val="20"/>
               </w:rPr>
-              <w:t xml:space="preserve">Safe-MARL 可行率</w:t>
+              <w:t xml:space="preserve">预测达标率</w:t>
             </w:r>
           </w:p>
         </w:tc>
@@ -809,7 +825,7 @@
                 <w:sz w:val="20"/>
                 <w:szCs w:val="20"/>
               </w:rPr>
-              <w:t xml:space="preserve">所有动作经过安全盾</w:t>
+              <w:t xml:space="preserve">COD/NH3-N/TP/TN 四目标</w:t>
             </w:r>
           </w:p>
         </w:tc>
@@ -840,7 +856,7 @@
                 <w:sz w:val="20"/>
                 <w:szCs w:val="20"/>
               </w:rPr>
-              <w:t xml:space="preserve">当前控制节能/节药</w:t>
+              <w:t xml:space="preserve">Safe-MARL 可行率</w:t>
             </w:r>
           </w:p>
         </w:tc>
@@ -866,7 +882,7 @@
                 <w:sz w:val="20"/>
                 <w:szCs w:val="20"/>
               </w:rPr>
-              <w:t xml:space="preserve">38.70% / 69.63%</w:t>
+              <w:t xml:space="preserve">100.0%</w:t>
             </w:r>
           </w:p>
         </w:tc>
@@ -892,7 +908,7 @@
                 <w:sz w:val="20"/>
                 <w:szCs w:val="20"/>
               </w:rPr>
-              <w:t xml:space="preserve">安全仲裁后最终推荐</w:t>
+              <w:t xml:space="preserve">所有动作经过安全盾</w:t>
             </w:r>
           </w:p>
         </w:tc>
@@ -923,7 +939,7 @@
                 <w:sz w:val="20"/>
                 <w:szCs w:val="20"/>
               </w:rPr>
-              <w:t xml:space="preserve">传统定值节能/节药</w:t>
+              <w:t xml:space="preserve">当前控制节能/节药</w:t>
             </w:r>
           </w:p>
         </w:tc>
@@ -949,7 +965,7 @@
                 <w:sz w:val="20"/>
                 <w:szCs w:val="20"/>
               </w:rPr>
-              <w:t xml:space="preserve">44.98% / 88.97%</w:t>
+              <w:t xml:space="preserve">38.70% / 69.63%</w:t>
             </w:r>
           </w:p>
         </w:tc>
@@ -975,7 +991,7 @@
                 <w:sz w:val="20"/>
                 <w:szCs w:val="20"/>
               </w:rPr>
-              <w:t xml:space="preserve">训练期 P90 保守定值对照</w:t>
+              <w:t xml:space="preserve">安全仲裁后最终推荐</w:t>
             </w:r>
           </w:p>
         </w:tc>
@@ -1006,7 +1022,7 @@
                 <w:sz w:val="20"/>
                 <w:szCs w:val="20"/>
               </w:rPr>
-              <w:t xml:space="preserve">P95 响应时间</w:t>
+              <w:t xml:space="preserve">传统定值节能/节药</w:t>
             </w:r>
           </w:p>
         </w:tc>
@@ -1032,7 +1048,7 @@
                 <w:sz w:val="20"/>
                 <w:szCs w:val="20"/>
               </w:rPr>
-              <w:t xml:space="preserve">1.9 ms</w:t>
+              <w:t xml:space="preserve">44.98% / 88.97%</w:t>
             </w:r>
           </w:p>
         </w:tc>
@@ -1058,7 +1074,7 @@
                 <w:sz w:val="20"/>
                 <w:szCs w:val="20"/>
               </w:rPr>
-              <w:t xml:space="preserve">单组推荐响应 ≤1s</w:t>
+              <w:t xml:space="preserve">训练期 P90 保守定值对照</w:t>
             </w:r>
           </w:p>
         </w:tc>
@@ -1089,6 +1105,172 @@
                 <w:sz w:val="20"/>
                 <w:szCs w:val="20"/>
               </w:rPr>
+              <w:t xml:space="preserve">P95 响应时间</w:t>
+            </w:r>
+          </w:p>
+        </w:tc>
+        <w:tc>
+          <w:tcPr>
+            <w:tcW w:type="dxa" w:w="3150"/>
+            <w:tcBorders>
+              <w:top w:val="single" w:color="B8CDD4" w:sz="1"/>
+              <w:left w:val="single" w:color="B8CDD4" w:sz="1"/>
+              <w:bottom w:val="single" w:color="B8CDD4" w:sz="1"/>
+              <w:right w:val="single" w:color="B8CDD4" w:sz="1"/>
+            </w:tcBorders>
+            <w:vAlign w:val="center"/>
+          </w:tcPr>
+          <w:p>
+            <w:pPr>
+              <w:jc w:val="left"/>
+            </w:pPr>
+            <w:r>
+              <w:rPr>
+                <w:b w:val="false"/>
+                <w:bCs w:val="false"/>
+                <w:sz w:val="20"/>
+                <w:szCs w:val="20"/>
+              </w:rPr>
+              <w:t xml:space="preserve">1.9 ms</w:t>
+            </w:r>
+          </w:p>
+        </w:tc>
+        <w:tc>
+          <w:tcPr>
+            <w:tcW w:type="dxa" w:w="3110"/>
+            <w:tcBorders>
+              <w:top w:val="single" w:color="B8CDD4" w:sz="1"/>
+              <w:left w:val="single" w:color="B8CDD4" w:sz="1"/>
+              <w:bottom w:val="single" w:color="B8CDD4" w:sz="1"/>
+              <w:right w:val="single" w:color="B8CDD4" w:sz="1"/>
+            </w:tcBorders>
+            <w:vAlign w:val="center"/>
+          </w:tcPr>
+          <w:p>
+            <w:pPr>
+              <w:jc w:val="left"/>
+            </w:pPr>
+            <w:r>
+              <w:rPr>
+                <w:b w:val="false"/>
+                <w:bCs w:val="false"/>
+                <w:sz w:val="20"/>
+                <w:szCs w:val="20"/>
+              </w:rPr>
+              <w:t xml:space="preserve">单组推荐响应 ≤1s</w:t>
+            </w:r>
+          </w:p>
+        </w:tc>
+      </w:tr>
+      <w:tr>
+        <w:trPr>
+          <w:tblHeader w:val="false"/>
+        </w:trPr>
+        <w:tc>
+          <w:tcPr>
+            <w:tcW w:type="dxa" w:w="3100"/>
+            <w:tcBorders>
+              <w:top w:val="single" w:color="B8CDD4" w:sz="1"/>
+              <w:left w:val="single" w:color="B8CDD4" w:sz="1"/>
+              <w:bottom w:val="single" w:color="B8CDD4" w:sz="1"/>
+              <w:right w:val="single" w:color="B8CDD4" w:sz="1"/>
+            </w:tcBorders>
+            <w:vAlign w:val="center"/>
+          </w:tcPr>
+          <w:p>
+            <w:pPr>
+              <w:jc w:val="left"/>
+            </w:pPr>
+            <w:r>
+              <w:rPr>
+                <w:b w:val="false"/>
+                <w:bCs w:val="false"/>
+                <w:sz w:val="20"/>
+                <w:szCs w:val="20"/>
+              </w:rPr>
+              <w:t xml:space="preserve">2分钟仿真收益</w:t>
+            </w:r>
+          </w:p>
+        </w:tc>
+        <w:tc>
+          <w:tcPr>
+            <w:tcW w:type="dxa" w:w="3150"/>
+            <w:tcBorders>
+              <w:top w:val="single" w:color="B8CDD4" w:sz="1"/>
+              <w:left w:val="single" w:color="B8CDD4" w:sz="1"/>
+              <w:bottom w:val="single" w:color="B8CDD4" w:sz="1"/>
+              <w:right w:val="single" w:color="B8CDD4" w:sz="1"/>
+            </w:tcBorders>
+            <w:vAlign w:val="center"/>
+          </w:tcPr>
+          <w:p>
+            <w:pPr>
+              <w:jc w:val="left"/>
+            </w:pPr>
+            <w:r>
+              <w:rPr>
+                <w:b w:val="false"/>
+                <w:bCs w:val="false"/>
+                <w:sz w:val="20"/>
+                <w:szCs w:val="20"/>
+              </w:rPr>
+              <w:t xml:space="preserve">2.68%</w:t>
+            </w:r>
+          </w:p>
+        </w:tc>
+        <w:tc>
+          <w:tcPr>
+            <w:tcW w:type="dxa" w:w="3110"/>
+            <w:tcBorders>
+              <w:top w:val="single" w:color="B8CDD4" w:sz="1"/>
+              <w:left w:val="single" w:color="B8CDD4" w:sz="1"/>
+              <w:bottom w:val="single" w:color="B8CDD4" w:sz="1"/>
+              <w:right w:val="single" w:color="B8CDD4" w:sz="1"/>
+            </w:tcBorders>
+            <w:vAlign w:val="center"/>
+          </w:tcPr>
+          <w:p>
+            <w:pPr>
+              <w:jc w:val="left"/>
+            </w:pPr>
+            <w:r>
+              <w:rPr>
+                <w:b w:val="false"/>
+                <w:bCs w:val="false"/>
+                <w:sz w:val="20"/>
+                <w:szCs w:val="20"/>
+              </w:rPr>
+              <w:t xml:space="preserve">P95 最大决策 2.75 ms</w:t>
+            </w:r>
+          </w:p>
+        </w:tc>
+      </w:tr>
+      <w:tr>
+        <w:trPr>
+          <w:tblHeader w:val="false"/>
+        </w:trPr>
+        <w:tc>
+          <w:tcPr>
+            <w:tcW w:type="dxa" w:w="3100"/>
+            <w:tcBorders>
+              <w:top w:val="single" w:color="B8CDD4" w:sz="1"/>
+              <w:left w:val="single" w:color="B8CDD4" w:sz="1"/>
+              <w:bottom w:val="single" w:color="B8CDD4" w:sz="1"/>
+              <w:right w:val="single" w:color="B8CDD4" w:sz="1"/>
+            </w:tcBorders>
+            <w:vAlign w:val="center"/>
+          </w:tcPr>
+          <w:p>
+            <w:pPr>
+              <w:jc w:val="left"/>
+            </w:pPr>
+            <w:r>
+              <w:rPr>
+                <w:b w:val="false"/>
+                <w:bCs w:val="false"/>
+                <w:sz w:val="20"/>
+                <w:szCs w:val="20"/>
+              </w:rPr>
               <w:t xml:space="preserve">论文复现动态节能</w:t>
             </w:r>
           </w:p>
@@ -1264,6 +1446,22 @@
           <w:sz w:val="22"/>
           <w:szCs w:val="22"/>
         </w:rPr>
+        <w:t xml:space="preserve">分钟级仿真中，2 分钟控制相对 60 分钟控制目标函数平均改善 2.68%，最低预测达标率 100.0%。</w:t>
+      </w:r>
+    </w:p>
+    <w:p>
+      <w:pPr>
+        <w:pStyle w:val="ListParagraph"/>
+        <w:numPr>
+          <w:ilvl w:val="0"/>
+          <w:numId w:val="2"/>
+        </w:numPr>
+      </w:pPr>
+      <w:r>
+        <w:rPr>
+          <w:sz w:val="22"/>
+          <w:szCs w:val="22"/>
+        </w:rPr>
         <w:t xml:space="preserve">论文复现动态回放节能为 4.45%。</w:t>
       </w:r>
     </w:p>
@@ -1304,6 +1502,22 @@
           <w:sz w:val="22"/>
           <w:szCs w:val="22"/>
         </w:rPr>
+        <w:t xml:space="preserve">引入 Agtrup/BlueKolding 2 分钟 SCADA 与 IWA BSM1 15 分钟动态进水，补足小时级数据对投药时机的限制。</w:t>
+      </w:r>
+    </w:p>
+    <w:p>
+      <w:pPr>
+        <w:pStyle w:val="ListParagraph"/>
+        <w:numPr>
+          <w:ilvl w:val="0"/>
+          <w:numId w:val="2"/>
+        </w:numPr>
+      </w:pPr>
+      <w:r>
+        <w:rPr>
+          <w:sz w:val="22"/>
+          <w:szCs w:val="22"/>
+        </w:rPr>
         <w:t xml:space="preserve">双智能体协同控制曝气与投药，兼顾合规、能耗、药耗和平滑性。</w:t>
       </w:r>
     </w:p>
@@ -1336,7 +1550,7 @@
           <w:sz w:val="22"/>
           <w:szCs w:val="22"/>
         </w:rPr>
-        <w:t xml:space="preserve">结合实时智能控制论文的动态特征思想，形成小时级代理动态特征和在线控制展示。</w:t>
+        <w:t xml:space="preserve">结合实时智能控制论文的动态特征思想，形成小时级代理动态特征和分钟级控制周期仿真。</w:t>
       </w:r>
     </w:p>
     <w:p>

</xml_diff>